<commit_message>
feat: live Yahoo Finance data injected into Aoife's research prompt
Browser (Live Mode):
- fetchYahooMeta() fetches ^ISEQ + 6 stock symbols via Yahoo Finance v8/chart API
- Falls back to allorigins.win CORS proxy if direct fetch is blocked
- buildMarketContext() formats prices, day ranges, 52w ranges into prompt context
- Market data prepended to Aoife's user message before callLLM()
- Aoife's system prompt updated to treat live data as ground truth

Python (pipeline.py):
- fetch_iseq_market_data() uses yfinance to pull 5d + 1y history per symbol
- Per-agent AGENT_MAX_TOKENS dict (Maker gets 8000)
- Markdown fence stripping applied to Maker output
- requirements.txt: added yfinance>=0.2.50

Docs & skills:
- skill/researcher.md updated with live data table and usage notes
- alphaeire-agents.zip rebuilt with updated researcher.md
- AlphaEire_Capital_Report.docx regenerated (Yahoo Finance section added)

Co-Authored-By: Claude Sonnet 4.6 <noreply@anthropic.com>
</commit_message>
<xml_diff>
--- a/AlphaEire_Capital_Report.docx
+++ b/AlphaEire_Capital_Report.docx
@@ -151,7 +151,21 @@
         <w:t xml:space="preserve">Produces: </w:t>
       </w:r>
       <w:r>
-        <w:t>Structured research brief with 3–5 ISEQ stock picks, signal types, rationale, risk flags, and market outlook</w:t>
+        <w:t>Structured research brief with 3–5 ISEQ stock picks grounded in live Yahoo Finance data: signal types, live-price rationale, risk flags, and market outlook</w:t>
+      </w:r>
+    </w:p>
+    <w:p>
+      <w:pPr>
+        <w:spacing w:after="80"/>
+      </w:pPr>
+      <w:r>
+        <w:rPr>
+          <w:b/>
+        </w:rPr>
+        <w:t xml:space="preserve">Live Data: </w:t>
+      </w:r>
+      <w:r>
+        <w:t>^ISEQ, AIBG.I, BIRG.I, RYA.I, CRH.L, DCC.L, PTSB.I — fetched from Yahoo Finance before each pipeline run</w:t>
       </w:r>
     </w:p>
     <w:p>
@@ -175,7 +189,7 @@
           <w:b w:val="0"/>
           <w:i/>
         </w:rPr>
-        <w:t>"You are Aoife, a senior equity analyst at AlphaEire Capital, an Irish investment firm focused on ISEQ-listed stocks. Your role is to analyse current Irish market conditions, identify 3-5 stocks showing strong signals (momentum, undervaluation, or volatility opportunity), and produce a structured research brief. For each stock provide: ticker, sector, current signal type, key rationale (2-3 sentences), and a risk flag. Close with an overall Irish market outlook paragraph. Be precise, data-informed, and professional. Use realistic ISEQ tickers such as CRH.L, BIRG.I, AIB.I, RYA.I, KRZ.I, DCC.L."</w:t>
+        <w:t>"You are Aoife, a senior equity analyst at AlphaEire Capital, an Irish investment firm focused on ISEQ-listed stocks. Live market data from Yahoo Finance will be provided at the top of the user message — treat it as ground truth for current prices and movements. Your role is to analyse this live ISEQ data, identify 3-5 stocks showing strong signals (momentum, undervaluation, or volatility opportunity), and produce a structured research brief. For each stock provide: ticker, sector, current price, signal type, key rationale (2-3 sentences grounded in the live data), and a risk flag. Close with an overall Irish market outlook paragraph. Be precise, data-driven, and professional."</w:t>
       </w:r>
     </w:p>
     <w:p>
@@ -187,7 +201,19 @@
           <w:b w:val="0"/>
           <w:i w:val="0"/>
         </w:rPr>
-        <w:t>Personality: Analytically rigorous and evidence-first. Aoife speaks with the measured authority of a senior CFA charterholder — structured output, no speculation, precise use of financial terminology. Her output is the foundation the entire pipeline builds on.</w:t>
+        <w:t>Data pipeline: Before Aoife runs, the system fetches real-time prices, day ranges, and 52-week ranges for 7 ISEQ symbols from the Yahoo Finance v8/chart API (browser) or the yfinance Python library (pipeline.py). This data is prepended to her user message, grounding every stock pick in current market reality rather than training-data estimates.</w:t>
+      </w:r>
+    </w:p>
+    <w:p>
+      <w:pPr>
+        <w:spacing w:after="120"/>
+      </w:pPr>
+      <w:r>
+        <w:rPr>
+          <w:b w:val="0"/>
+          <w:i w:val="0"/>
+        </w:rPr>
+        <w:t>Personality: Analytically rigorous and evidence-first. Aoife speaks with the measured authority of a senior CFA charterholder — structured output, no speculation, every claim referenced to a live data point. Her output is the foundation the entire pipeline builds on.</w:t>
       </w:r>
     </w:p>
     <w:p/>
@@ -503,7 +529,19 @@
           <w:b w:val="0"/>
           <w:i w:val="0"/>
         </w:rPr>
-        <w:t>The pipeline runs sequentially: each agent's complete text output is injected directly into the next agent's user message as structured context, delimited by labelled section headers (e.g. --- RESEARCH BRIEF ---). This means every downstream agent has access to the full upstream reasoning, not a summarised version of it.</w:t>
+        <w:t>Before the pipeline starts, live market data is fetched from Yahoo Finance for 7 ISEQ symbols (^ISEQ All Share index, AIBG.I, BIRG.I, RYA.I, CRH.L, DCC.L, PTSB.I): current price, day range, and 52-week range. This data is prepended to Aoife's user message so her stock picks are grounded in current reality, not training-data estimates.</w:t>
+      </w:r>
+    </w:p>
+    <w:p>
+      <w:pPr>
+        <w:spacing w:after="120"/>
+      </w:pPr>
+      <w:r>
+        <w:rPr>
+          <w:b w:val="0"/>
+          <w:i w:val="0"/>
+        </w:rPr>
+        <w:t>Each agent's complete text output is then injected directly into the next agent's user message as structured context, delimited by labelled section headers (e.g. --- RESEARCH BRIEF ---). Every downstream agent has access to the full upstream reasoning, not a summarised version of it.</w:t>
       </w:r>
     </w:p>
     <w:p>

</xml_diff>